<commit_message>
Add query result images to report
Render A1-C2 query results as PNG tables and embed them in report.docx
and report.md. Add the Star Schema diagram to results/.

Co-Authored-By: Claude Haiku 5.5 <noreply@anthropic.com>
</commit_message>
<xml_diff>
--- a/report.docx
+++ b/report.docx
@@ -522,6 +522,523 @@
         <w:pStyle w:val="Heading1"/>
       </w:pPr>
       <w:r>
+        <w:t>ภาพผลลัพธ์จากการรัน query</w:t>
+      </w:r>
+    </w:p>
+    <w:p>
+      <w:r>
+        <w:t>ภาพด้านล่างเป็นผลลัพธ์จากการรัน 67160175.sql บน DuckDB แสดงไม่เกิน 12 แถวต่อภาพ ไฟล์ภาพอยู่ในโฟลเดอร์ results</w:t>
+      </w:r>
+    </w:p>
+    <w:p>
+      <w:r>
+        <w:drawing>
+          <wp:inline xmlns:a="http://schemas.openxmlformats.org/drawingml/2006/main" xmlns:pic="http://schemas.openxmlformats.org/drawingml/2006/picture">
+            <wp:extent cx="5400000" cy="3115556"/>
+            <wp:docPr id="2" name="Picture 2"/>
+            <wp:cNvGraphicFramePr>
+              <a:graphicFrameLocks noChangeAspect="1"/>
+            </wp:cNvGraphicFramePr>
+            <a:graphic>
+              <a:graphicData uri="http://schemas.openxmlformats.org/drawingml/2006/picture">
+                <pic:pic>
+                  <pic:nvPicPr>
+                    <pic:cNvPr id="0" name="A1.png"/>
+                    <pic:cNvPicPr/>
+                  </pic:nvPicPr>
+                  <pic:blipFill>
+                    <a:blip r:embed="rId10"/>
+                    <a:stretch>
+                      <a:fillRect/>
+                    </a:stretch>
+                  </pic:blipFill>
+                  <pic:spPr>
+                    <a:xfrm>
+                      <a:off x="0" y="0"/>
+                      <a:ext cx="5400000" cy="3115556"/>
+                    </a:xfrm>
+                    <a:prstGeom prst="rect"/>
+                  </pic:spPr>
+                </pic:pic>
+              </a:graphicData>
+            </a:graphic>
+          </wp:inline>
+        </w:drawing>
+      </w:r>
+    </w:p>
+    <w:p>
+      <w:r>
+        <w:drawing>
+          <wp:inline xmlns:a="http://schemas.openxmlformats.org/drawingml/2006/main" xmlns:pic="http://schemas.openxmlformats.org/drawingml/2006/picture">
+            <wp:extent cx="5400000" cy="3115556"/>
+            <wp:docPr id="3" name="Picture 3"/>
+            <wp:cNvGraphicFramePr>
+              <a:graphicFrameLocks noChangeAspect="1"/>
+            </wp:cNvGraphicFramePr>
+            <a:graphic>
+              <a:graphicData uri="http://schemas.openxmlformats.org/drawingml/2006/picture">
+                <pic:pic>
+                  <pic:nvPicPr>
+                    <pic:cNvPr id="0" name="A2.png"/>
+                    <pic:cNvPicPr/>
+                  </pic:nvPicPr>
+                  <pic:blipFill>
+                    <a:blip r:embed="rId11"/>
+                    <a:stretch>
+                      <a:fillRect/>
+                    </a:stretch>
+                  </pic:blipFill>
+                  <pic:spPr>
+                    <a:xfrm>
+                      <a:off x="0" y="0"/>
+                      <a:ext cx="5400000" cy="3115556"/>
+                    </a:xfrm>
+                    <a:prstGeom prst="rect"/>
+                  </pic:spPr>
+                </pic:pic>
+              </a:graphicData>
+            </a:graphic>
+          </wp:inline>
+        </w:drawing>
+      </w:r>
+    </w:p>
+    <w:p>
+      <w:r>
+        <w:drawing>
+          <wp:inline xmlns:a="http://schemas.openxmlformats.org/drawingml/2006/main" xmlns:pic="http://schemas.openxmlformats.org/drawingml/2006/picture">
+            <wp:extent cx="5400000" cy="1604444"/>
+            <wp:docPr id="4" name="Picture 4"/>
+            <wp:cNvGraphicFramePr>
+              <a:graphicFrameLocks noChangeAspect="1"/>
+            </wp:cNvGraphicFramePr>
+            <a:graphic>
+              <a:graphicData uri="http://schemas.openxmlformats.org/drawingml/2006/picture">
+                <pic:pic>
+                  <pic:nvPicPr>
+                    <pic:cNvPr id="0" name="A3.png"/>
+                    <pic:cNvPicPr/>
+                  </pic:nvPicPr>
+                  <pic:blipFill>
+                    <a:blip r:embed="rId12"/>
+                    <a:stretch>
+                      <a:fillRect/>
+                    </a:stretch>
+                  </pic:blipFill>
+                  <pic:spPr>
+                    <a:xfrm>
+                      <a:off x="0" y="0"/>
+                      <a:ext cx="5400000" cy="1604444"/>
+                    </a:xfrm>
+                    <a:prstGeom prst="rect"/>
+                  </pic:spPr>
+                </pic:pic>
+              </a:graphicData>
+            </a:graphic>
+          </wp:inline>
+        </w:drawing>
+      </w:r>
+    </w:p>
+    <w:p>
+      <w:r>
+        <w:drawing>
+          <wp:inline xmlns:a="http://schemas.openxmlformats.org/drawingml/2006/main" xmlns:pic="http://schemas.openxmlformats.org/drawingml/2006/picture">
+            <wp:extent cx="5400000" cy="3546667"/>
+            <wp:docPr id="5" name="Picture 5"/>
+            <wp:cNvGraphicFramePr>
+              <a:graphicFrameLocks noChangeAspect="1"/>
+            </wp:cNvGraphicFramePr>
+            <a:graphic>
+              <a:graphicData uri="http://schemas.openxmlformats.org/drawingml/2006/picture">
+                <pic:pic>
+                  <pic:nvPicPr>
+                    <pic:cNvPr id="0" name="A4.png"/>
+                    <pic:cNvPicPr/>
+                  </pic:nvPicPr>
+                  <pic:blipFill>
+                    <a:blip r:embed="rId13"/>
+                    <a:stretch>
+                      <a:fillRect/>
+                    </a:stretch>
+                  </pic:blipFill>
+                  <pic:spPr>
+                    <a:xfrm>
+                      <a:off x="0" y="0"/>
+                      <a:ext cx="5400000" cy="3546667"/>
+                    </a:xfrm>
+                    <a:prstGeom prst="rect"/>
+                  </pic:spPr>
+                </pic:pic>
+              </a:graphicData>
+            </a:graphic>
+          </wp:inline>
+        </w:drawing>
+      </w:r>
+    </w:p>
+    <w:p>
+      <w:r>
+        <w:drawing>
+          <wp:inline xmlns:a="http://schemas.openxmlformats.org/drawingml/2006/main" xmlns:pic="http://schemas.openxmlformats.org/drawingml/2006/picture">
+            <wp:extent cx="5400000" cy="1822222"/>
+            <wp:docPr id="6" name="Picture 6"/>
+            <wp:cNvGraphicFramePr>
+              <a:graphicFrameLocks noChangeAspect="1"/>
+            </wp:cNvGraphicFramePr>
+            <a:graphic>
+              <a:graphicData uri="http://schemas.openxmlformats.org/drawingml/2006/picture">
+                <pic:pic>
+                  <pic:nvPicPr>
+                    <pic:cNvPr id="0" name="A5.png"/>
+                    <pic:cNvPicPr/>
+                  </pic:nvPicPr>
+                  <pic:blipFill>
+                    <a:blip r:embed="rId14"/>
+                    <a:stretch>
+                      <a:fillRect/>
+                    </a:stretch>
+                  </pic:blipFill>
+                  <pic:spPr>
+                    <a:xfrm>
+                      <a:off x="0" y="0"/>
+                      <a:ext cx="5400000" cy="1822222"/>
+                    </a:xfrm>
+                    <a:prstGeom prst="rect"/>
+                  </pic:spPr>
+                </pic:pic>
+              </a:graphicData>
+            </a:graphic>
+          </wp:inline>
+        </w:drawing>
+      </w:r>
+    </w:p>
+    <w:p>
+      <w:r>
+        <w:drawing>
+          <wp:inline xmlns:a="http://schemas.openxmlformats.org/drawingml/2006/main" xmlns:pic="http://schemas.openxmlformats.org/drawingml/2006/picture">
+            <wp:extent cx="5400000" cy="1604444"/>
+            <wp:docPr id="7" name="Picture 7"/>
+            <wp:cNvGraphicFramePr>
+              <a:graphicFrameLocks noChangeAspect="1"/>
+            </wp:cNvGraphicFramePr>
+            <a:graphic>
+              <a:graphicData uri="http://schemas.openxmlformats.org/drawingml/2006/picture">
+                <pic:pic>
+                  <pic:nvPicPr>
+                    <pic:cNvPr id="0" name="A6.png"/>
+                    <pic:cNvPicPr/>
+                  </pic:nvPicPr>
+                  <pic:blipFill>
+                    <a:blip r:embed="rId15"/>
+                    <a:stretch>
+                      <a:fillRect/>
+                    </a:stretch>
+                  </pic:blipFill>
+                  <pic:spPr>
+                    <a:xfrm>
+                      <a:off x="0" y="0"/>
+                      <a:ext cx="5400000" cy="1604444"/>
+                    </a:xfrm>
+                    <a:prstGeom prst="rect"/>
+                  </pic:spPr>
+                </pic:pic>
+              </a:graphicData>
+            </a:graphic>
+          </wp:inline>
+        </w:drawing>
+      </w:r>
+    </w:p>
+    <w:p>
+      <w:r>
+        <w:drawing>
+          <wp:inline xmlns:a="http://schemas.openxmlformats.org/drawingml/2006/main" xmlns:pic="http://schemas.openxmlformats.org/drawingml/2006/picture">
+            <wp:extent cx="5400000" cy="2035556"/>
+            <wp:docPr id="8" name="Picture 8"/>
+            <wp:cNvGraphicFramePr>
+              <a:graphicFrameLocks noChangeAspect="1"/>
+            </wp:cNvGraphicFramePr>
+            <a:graphic>
+              <a:graphicData uri="http://schemas.openxmlformats.org/drawingml/2006/picture">
+                <pic:pic>
+                  <pic:nvPicPr>
+                    <pic:cNvPr id="0" name="A7.png"/>
+                    <pic:cNvPicPr/>
+                  </pic:nvPicPr>
+                  <pic:blipFill>
+                    <a:blip r:embed="rId16"/>
+                    <a:stretch>
+                      <a:fillRect/>
+                    </a:stretch>
+                  </pic:blipFill>
+                  <pic:spPr>
+                    <a:xfrm>
+                      <a:off x="0" y="0"/>
+                      <a:ext cx="5400000" cy="2035556"/>
+                    </a:xfrm>
+                    <a:prstGeom prst="rect"/>
+                  </pic:spPr>
+                </pic:pic>
+              </a:graphicData>
+            </a:graphic>
+          </wp:inline>
+        </w:drawing>
+      </w:r>
+    </w:p>
+    <w:p>
+      <w:r>
+        <w:drawing>
+          <wp:inline xmlns:a="http://schemas.openxmlformats.org/drawingml/2006/main" xmlns:pic="http://schemas.openxmlformats.org/drawingml/2006/picture">
+            <wp:extent cx="5400000" cy="2466667"/>
+            <wp:docPr id="9" name="Picture 9"/>
+            <wp:cNvGraphicFramePr>
+              <a:graphicFrameLocks noChangeAspect="1"/>
+            </wp:cNvGraphicFramePr>
+            <a:graphic>
+              <a:graphicData uri="http://schemas.openxmlformats.org/drawingml/2006/picture">
+                <pic:pic>
+                  <pic:nvPicPr>
+                    <pic:cNvPr id="0" name="A8.png"/>
+                    <pic:cNvPicPr/>
+                  </pic:nvPicPr>
+                  <pic:blipFill>
+                    <a:blip r:embed="rId17"/>
+                    <a:stretch>
+                      <a:fillRect/>
+                    </a:stretch>
+                  </pic:blipFill>
+                  <pic:spPr>
+                    <a:xfrm>
+                      <a:off x="0" y="0"/>
+                      <a:ext cx="5400000" cy="2466667"/>
+                    </a:xfrm>
+                    <a:prstGeom prst="rect"/>
+                  </pic:spPr>
+                </pic:pic>
+              </a:graphicData>
+            </a:graphic>
+          </wp:inline>
+        </w:drawing>
+      </w:r>
+    </w:p>
+    <w:p>
+      <w:r>
+        <w:drawing>
+          <wp:inline xmlns:a="http://schemas.openxmlformats.org/drawingml/2006/main" xmlns:pic="http://schemas.openxmlformats.org/drawingml/2006/picture">
+            <wp:extent cx="5400000" cy="3546667"/>
+            <wp:docPr id="10" name="Picture 10"/>
+            <wp:cNvGraphicFramePr>
+              <a:graphicFrameLocks noChangeAspect="1"/>
+            </wp:cNvGraphicFramePr>
+            <a:graphic>
+              <a:graphicData uri="http://schemas.openxmlformats.org/drawingml/2006/picture">
+                <pic:pic>
+                  <pic:nvPicPr>
+                    <pic:cNvPr id="0" name="B2_mart.png"/>
+                    <pic:cNvPicPr/>
+                  </pic:nvPicPr>
+                  <pic:blipFill>
+                    <a:blip r:embed="rId18"/>
+                    <a:stretch>
+                      <a:fillRect/>
+                    </a:stretch>
+                  </pic:blipFill>
+                  <pic:spPr>
+                    <a:xfrm>
+                      <a:off x="0" y="0"/>
+                      <a:ext cx="5400000" cy="3546667"/>
+                    </a:xfrm>
+                    <a:prstGeom prst="rect"/>
+                  </pic:spPr>
+                </pic:pic>
+              </a:graphicData>
+            </a:graphic>
+          </wp:inline>
+        </w:drawing>
+      </w:r>
+    </w:p>
+    <w:p>
+      <w:r>
+        <w:drawing>
+          <wp:inline xmlns:a="http://schemas.openxmlformats.org/drawingml/2006/main" xmlns:pic="http://schemas.openxmlformats.org/drawingml/2006/picture">
+            <wp:extent cx="5400000" cy="1177778"/>
+            <wp:docPr id="11" name="Picture 11"/>
+            <wp:cNvGraphicFramePr>
+              <a:graphicFrameLocks noChangeAspect="1"/>
+            </wp:cNvGraphicFramePr>
+            <a:graphic>
+              <a:graphicData uri="http://schemas.openxmlformats.org/drawingml/2006/picture">
+                <pic:pic>
+                  <pic:nvPicPr>
+                    <pic:cNvPr id="0" name="B3_missing_customer.png"/>
+                    <pic:cNvPicPr/>
+                  </pic:nvPicPr>
+                  <pic:blipFill>
+                    <a:blip r:embed="rId19"/>
+                    <a:stretch>
+                      <a:fillRect/>
+                    </a:stretch>
+                  </pic:blipFill>
+                  <pic:spPr>
+                    <a:xfrm>
+                      <a:off x="0" y="0"/>
+                      <a:ext cx="5400000" cy="1177778"/>
+                    </a:xfrm>
+                    <a:prstGeom prst="rect"/>
+                  </pic:spPr>
+                </pic:pic>
+              </a:graphicData>
+            </a:graphic>
+          </wp:inline>
+        </w:drawing>
+      </w:r>
+    </w:p>
+    <w:p>
+      <w:r>
+        <w:drawing>
+          <wp:inline xmlns:a="http://schemas.openxmlformats.org/drawingml/2006/main" xmlns:pic="http://schemas.openxmlformats.org/drawingml/2006/picture">
+            <wp:extent cx="5400000" cy="1177778"/>
+            <wp:docPr id="12" name="Picture 12"/>
+            <wp:cNvGraphicFramePr>
+              <a:graphicFrameLocks noChangeAspect="1"/>
+            </wp:cNvGraphicFramePr>
+            <a:graphic>
+              <a:graphicData uri="http://schemas.openxmlformats.org/drawingml/2006/picture">
+                <pic:pic>
+                  <pic:nvPicPr>
+                    <pic:cNvPr id="0" name="B3_quantity.png"/>
+                    <pic:cNvPicPr/>
+                  </pic:nvPicPr>
+                  <pic:blipFill>
+                    <a:blip r:embed="rId20"/>
+                    <a:stretch>
+                      <a:fillRect/>
+                    </a:stretch>
+                  </pic:blipFill>
+                  <pic:spPr>
+                    <a:xfrm>
+                      <a:off x="0" y="0"/>
+                      <a:ext cx="5400000" cy="1177778"/>
+                    </a:xfrm>
+                    <a:prstGeom prst="rect"/>
+                  </pic:spPr>
+                </pic:pic>
+              </a:graphicData>
+            </a:graphic>
+          </wp:inline>
+        </w:drawing>
+      </w:r>
+    </w:p>
+    <w:p>
+      <w:r>
+        <w:drawing>
+          <wp:inline xmlns:a="http://schemas.openxmlformats.org/drawingml/2006/main" xmlns:pic="http://schemas.openxmlformats.org/drawingml/2006/picture">
+            <wp:extent cx="5400000" cy="1177778"/>
+            <wp:docPr id="13" name="Picture 13"/>
+            <wp:cNvGraphicFramePr>
+              <a:graphicFrameLocks noChangeAspect="1"/>
+            </wp:cNvGraphicFramePr>
+            <a:graphic>
+              <a:graphicData uri="http://schemas.openxmlformats.org/drawingml/2006/picture">
+                <pic:pic>
+                  <pic:nvPicPr>
+                    <pic:cNvPr id="0" name="B3_missing_product.png"/>
+                    <pic:cNvPicPr/>
+                  </pic:nvPicPr>
+                  <pic:blipFill>
+                    <a:blip r:embed="rId21"/>
+                    <a:stretch>
+                      <a:fillRect/>
+                    </a:stretch>
+                  </pic:blipFill>
+                  <pic:spPr>
+                    <a:xfrm>
+                      <a:off x="0" y="0"/>
+                      <a:ext cx="5400000" cy="1177778"/>
+                    </a:xfrm>
+                    <a:prstGeom prst="rect"/>
+                  </pic:spPr>
+                </pic:pic>
+              </a:graphicData>
+            </a:graphic>
+          </wp:inline>
+        </w:drawing>
+      </w:r>
+    </w:p>
+    <w:p>
+      <w:r>
+        <w:drawing>
+          <wp:inline xmlns:a="http://schemas.openxmlformats.org/drawingml/2006/main" xmlns:pic="http://schemas.openxmlformats.org/drawingml/2006/picture">
+            <wp:extent cx="5400000" cy="3115556"/>
+            <wp:docPr id="14" name="Picture 14"/>
+            <wp:cNvGraphicFramePr>
+              <a:graphicFrameLocks noChangeAspect="1"/>
+            </wp:cNvGraphicFramePr>
+            <a:graphic>
+              <a:graphicData uri="http://schemas.openxmlformats.org/drawingml/2006/picture">
+                <pic:pic>
+                  <pic:nvPicPr>
+                    <pic:cNvPr id="0" name="C1.png"/>
+                    <pic:cNvPicPr/>
+                  </pic:nvPicPr>
+                  <pic:blipFill>
+                    <a:blip r:embed="rId22"/>
+                    <a:stretch>
+                      <a:fillRect/>
+                    </a:stretch>
+                  </pic:blipFill>
+                  <pic:spPr>
+                    <a:xfrm>
+                      <a:off x="0" y="0"/>
+                      <a:ext cx="5400000" cy="3115556"/>
+                    </a:xfrm>
+                    <a:prstGeom prst="rect"/>
+                  </pic:spPr>
+                </pic:pic>
+              </a:graphicData>
+            </a:graphic>
+          </wp:inline>
+        </w:drawing>
+      </w:r>
+    </w:p>
+    <w:p>
+      <w:r>
+        <w:drawing>
+          <wp:inline xmlns:a="http://schemas.openxmlformats.org/drawingml/2006/main" xmlns:pic="http://schemas.openxmlformats.org/drawingml/2006/picture">
+            <wp:extent cx="5400000" cy="3546667"/>
+            <wp:docPr id="15" name="Picture 15"/>
+            <wp:cNvGraphicFramePr>
+              <a:graphicFrameLocks noChangeAspect="1"/>
+            </wp:cNvGraphicFramePr>
+            <a:graphic>
+              <a:graphicData uri="http://schemas.openxmlformats.org/drawingml/2006/picture">
+                <pic:pic>
+                  <pic:nvPicPr>
+                    <pic:cNvPr id="0" name="C2.png"/>
+                    <pic:cNvPicPr/>
+                  </pic:nvPicPr>
+                  <pic:blipFill>
+                    <a:blip r:embed="rId23"/>
+                    <a:stretch>
+                      <a:fillRect/>
+                    </a:stretch>
+                  </pic:blipFill>
+                  <pic:spPr>
+                    <a:xfrm>
+                      <a:off x="0" y="0"/>
+                      <a:ext cx="5400000" cy="3546667"/>
+                    </a:xfrm>
+                    <a:prstGeom prst="rect"/>
+                  </pic:spPr>
+                </pic:pic>
+              </a:graphicData>
+            </a:graphic>
+          </wp:inline>
+        </w:drawing>
+      </w:r>
+    </w:p>
+    <w:p>
+      <w:pPr>
+        <w:pStyle w:val="Heading1"/>
+      </w:pPr>
+      <w:r>
         <w:t>ส่วน D: Executive Insight</w:t>
       </w:r>
     </w:p>

</xml_diff>

<commit_message>
Replace rendered result tables with DuckDB shell screenshots
Result images in results/ are now screenshots of the lab queries run in
the DuckDB Web Shell. Rebuild report.docx and report.md to match.

Co-Authored-By: Claude Haiku 5.5 <noreply@anthropic.com>
</commit_message>
<xml_diff>
--- a/report.docx
+++ b/report.docx
@@ -527,14 +527,14 @@
     </w:p>
     <w:p>
       <w:r>
-        <w:t>ภาพด้านล่างเป็นผลลัพธ์จากการรัน 67160175.sql บน DuckDB แสดงไม่เกิน 12 แถวต่อภาพ ไฟล์ภาพอยู่ในโฟลเดอร์ results</w:t>
+        <w:t>ภาพด้านล่างเป็นภาพแคปหน้าจอจาก DuckDB Web Shell (shell.duckdb.org) ที่รันคำสั่งจาก 67160175.sql ทีละข้อ A4 และ C2 แสดง 12 แถวแรก และ B2 แสดง 12 จาก 27 แถว ไฟล์ภาพอยู่ในโฟลเดอร์ results</w:t>
       </w:r>
     </w:p>
     <w:p>
       <w:r>
         <w:drawing>
           <wp:inline xmlns:a="http://schemas.openxmlformats.org/drawingml/2006/main" xmlns:pic="http://schemas.openxmlformats.org/drawingml/2006/picture">
-            <wp:extent cx="5400000" cy="3115556"/>
+            <wp:extent cx="5400000" cy="3610000"/>
             <wp:docPr id="2" name="Picture 2"/>
             <wp:cNvGraphicFramePr>
               <a:graphicFrameLocks noChangeAspect="1"/>
@@ -555,7 +555,7 @@
                   <pic:spPr>
                     <a:xfrm>
                       <a:off x="0" y="0"/>
-                      <a:ext cx="5400000" cy="3115556"/>
+                      <a:ext cx="5400000" cy="3610000"/>
                     </a:xfrm>
                     <a:prstGeom prst="rect"/>
                   </pic:spPr>
@@ -570,7 +570,7 @@
       <w:r>
         <w:drawing>
           <wp:inline xmlns:a="http://schemas.openxmlformats.org/drawingml/2006/main" xmlns:pic="http://schemas.openxmlformats.org/drawingml/2006/picture">
-            <wp:extent cx="5400000" cy="3115556"/>
+            <wp:extent cx="5400000" cy="2425000"/>
             <wp:docPr id="3" name="Picture 3"/>
             <wp:cNvGraphicFramePr>
               <a:graphicFrameLocks noChangeAspect="1"/>
@@ -591,7 +591,7 @@
                   <pic:spPr>
                     <a:xfrm>
                       <a:off x="0" y="0"/>
-                      <a:ext cx="5400000" cy="3115556"/>
+                      <a:ext cx="5400000" cy="2425000"/>
                     </a:xfrm>
                     <a:prstGeom prst="rect"/>
                   </pic:spPr>
@@ -606,7 +606,7 @@
       <w:r>
         <w:drawing>
           <wp:inline xmlns:a="http://schemas.openxmlformats.org/drawingml/2006/main" xmlns:pic="http://schemas.openxmlformats.org/drawingml/2006/picture">
-            <wp:extent cx="5400000" cy="1604444"/>
+            <wp:extent cx="5400000" cy="2425000"/>
             <wp:docPr id="4" name="Picture 4"/>
             <wp:cNvGraphicFramePr>
               <a:graphicFrameLocks noChangeAspect="1"/>
@@ -627,7 +627,7 @@
                   <pic:spPr>
                     <a:xfrm>
                       <a:off x="0" y="0"/>
-                      <a:ext cx="5400000" cy="1604444"/>
+                      <a:ext cx="5400000" cy="2425000"/>
                     </a:xfrm>
                     <a:prstGeom prst="rect"/>
                   </pic:spPr>
@@ -642,7 +642,7 @@
       <w:r>
         <w:drawing>
           <wp:inline xmlns:a="http://schemas.openxmlformats.org/drawingml/2006/main" xmlns:pic="http://schemas.openxmlformats.org/drawingml/2006/picture">
-            <wp:extent cx="5400000" cy="3546667"/>
+            <wp:extent cx="5400000" cy="2425000"/>
             <wp:docPr id="5" name="Picture 5"/>
             <wp:cNvGraphicFramePr>
               <a:graphicFrameLocks noChangeAspect="1"/>
@@ -663,7 +663,7 @@
                   <pic:spPr>
                     <a:xfrm>
                       <a:off x="0" y="0"/>
-                      <a:ext cx="5400000" cy="3546667"/>
+                      <a:ext cx="5400000" cy="2425000"/>
                     </a:xfrm>
                     <a:prstGeom prst="rect"/>
                   </pic:spPr>
@@ -678,7 +678,7 @@
       <w:r>
         <w:drawing>
           <wp:inline xmlns:a="http://schemas.openxmlformats.org/drawingml/2006/main" xmlns:pic="http://schemas.openxmlformats.org/drawingml/2006/picture">
-            <wp:extent cx="5400000" cy="1822222"/>
+            <wp:extent cx="5400000" cy="2425000"/>
             <wp:docPr id="6" name="Picture 6"/>
             <wp:cNvGraphicFramePr>
               <a:graphicFrameLocks noChangeAspect="1"/>
@@ -699,7 +699,7 @@
                   <pic:spPr>
                     <a:xfrm>
                       <a:off x="0" y="0"/>
-                      <a:ext cx="5400000" cy="1822222"/>
+                      <a:ext cx="5400000" cy="2425000"/>
                     </a:xfrm>
                     <a:prstGeom prst="rect"/>
                   </pic:spPr>
@@ -714,7 +714,7 @@
       <w:r>
         <w:drawing>
           <wp:inline xmlns:a="http://schemas.openxmlformats.org/drawingml/2006/main" xmlns:pic="http://schemas.openxmlformats.org/drawingml/2006/picture">
-            <wp:extent cx="5400000" cy="1604444"/>
+            <wp:extent cx="5400000" cy="2425000"/>
             <wp:docPr id="7" name="Picture 7"/>
             <wp:cNvGraphicFramePr>
               <a:graphicFrameLocks noChangeAspect="1"/>
@@ -735,7 +735,7 @@
                   <pic:spPr>
                     <a:xfrm>
                       <a:off x="0" y="0"/>
-                      <a:ext cx="5400000" cy="1604444"/>
+                      <a:ext cx="5400000" cy="2425000"/>
                     </a:xfrm>
                     <a:prstGeom prst="rect"/>
                   </pic:spPr>
@@ -750,7 +750,7 @@
       <w:r>
         <w:drawing>
           <wp:inline xmlns:a="http://schemas.openxmlformats.org/drawingml/2006/main" xmlns:pic="http://schemas.openxmlformats.org/drawingml/2006/picture">
-            <wp:extent cx="5400000" cy="2035556"/>
+            <wp:extent cx="5400000" cy="2425000"/>
             <wp:docPr id="8" name="Picture 8"/>
             <wp:cNvGraphicFramePr>
               <a:graphicFrameLocks noChangeAspect="1"/>
@@ -771,7 +771,7 @@
                   <pic:spPr>
                     <a:xfrm>
                       <a:off x="0" y="0"/>
-                      <a:ext cx="5400000" cy="2035556"/>
+                      <a:ext cx="5400000" cy="2425000"/>
                     </a:xfrm>
                     <a:prstGeom prst="rect"/>
                   </pic:spPr>
@@ -786,7 +786,7 @@
       <w:r>
         <w:drawing>
           <wp:inline xmlns:a="http://schemas.openxmlformats.org/drawingml/2006/main" xmlns:pic="http://schemas.openxmlformats.org/drawingml/2006/picture">
-            <wp:extent cx="5400000" cy="2466667"/>
+            <wp:extent cx="5400000" cy="2425000"/>
             <wp:docPr id="9" name="Picture 9"/>
             <wp:cNvGraphicFramePr>
               <a:graphicFrameLocks noChangeAspect="1"/>
@@ -807,7 +807,7 @@
                   <pic:spPr>
                     <a:xfrm>
                       <a:off x="0" y="0"/>
-                      <a:ext cx="5400000" cy="2466667"/>
+                      <a:ext cx="5400000" cy="2425000"/>
                     </a:xfrm>
                     <a:prstGeom prst="rect"/>
                   </pic:spPr>
@@ -822,7 +822,7 @@
       <w:r>
         <w:drawing>
           <wp:inline xmlns:a="http://schemas.openxmlformats.org/drawingml/2006/main" xmlns:pic="http://schemas.openxmlformats.org/drawingml/2006/picture">
-            <wp:extent cx="5400000" cy="3546667"/>
+            <wp:extent cx="5400000" cy="2425000"/>
             <wp:docPr id="10" name="Picture 10"/>
             <wp:cNvGraphicFramePr>
               <a:graphicFrameLocks noChangeAspect="1"/>
@@ -843,7 +843,7 @@
                   <pic:spPr>
                     <a:xfrm>
                       <a:off x="0" y="0"/>
-                      <a:ext cx="5400000" cy="3546667"/>
+                      <a:ext cx="5400000" cy="2425000"/>
                     </a:xfrm>
                     <a:prstGeom prst="rect"/>
                   </pic:spPr>
@@ -858,7 +858,7 @@
       <w:r>
         <w:drawing>
           <wp:inline xmlns:a="http://schemas.openxmlformats.org/drawingml/2006/main" xmlns:pic="http://schemas.openxmlformats.org/drawingml/2006/picture">
-            <wp:extent cx="5400000" cy="1177778"/>
+            <wp:extent cx="5400000" cy="2425000"/>
             <wp:docPr id="11" name="Picture 11"/>
             <wp:cNvGraphicFramePr>
               <a:graphicFrameLocks noChangeAspect="1"/>
@@ -879,7 +879,7 @@
                   <pic:spPr>
                     <a:xfrm>
                       <a:off x="0" y="0"/>
-                      <a:ext cx="5400000" cy="1177778"/>
+                      <a:ext cx="5400000" cy="2425000"/>
                     </a:xfrm>
                     <a:prstGeom prst="rect"/>
                   </pic:spPr>
@@ -894,7 +894,7 @@
       <w:r>
         <w:drawing>
           <wp:inline xmlns:a="http://schemas.openxmlformats.org/drawingml/2006/main" xmlns:pic="http://schemas.openxmlformats.org/drawingml/2006/picture">
-            <wp:extent cx="5400000" cy="1177778"/>
+            <wp:extent cx="5400000" cy="2425000"/>
             <wp:docPr id="12" name="Picture 12"/>
             <wp:cNvGraphicFramePr>
               <a:graphicFrameLocks noChangeAspect="1"/>
@@ -915,7 +915,7 @@
                   <pic:spPr>
                     <a:xfrm>
                       <a:off x="0" y="0"/>
-                      <a:ext cx="5400000" cy="1177778"/>
+                      <a:ext cx="5400000" cy="2425000"/>
                     </a:xfrm>
                     <a:prstGeom prst="rect"/>
                   </pic:spPr>
@@ -930,7 +930,7 @@
       <w:r>
         <w:drawing>
           <wp:inline xmlns:a="http://schemas.openxmlformats.org/drawingml/2006/main" xmlns:pic="http://schemas.openxmlformats.org/drawingml/2006/picture">
-            <wp:extent cx="5400000" cy="1177778"/>
+            <wp:extent cx="5400000" cy="2425000"/>
             <wp:docPr id="13" name="Picture 13"/>
             <wp:cNvGraphicFramePr>
               <a:graphicFrameLocks noChangeAspect="1"/>
@@ -951,7 +951,7 @@
                   <pic:spPr>
                     <a:xfrm>
                       <a:off x="0" y="0"/>
-                      <a:ext cx="5400000" cy="1177778"/>
+                      <a:ext cx="5400000" cy="2425000"/>
                     </a:xfrm>
                     <a:prstGeom prst="rect"/>
                   </pic:spPr>
@@ -966,7 +966,7 @@
       <w:r>
         <w:drawing>
           <wp:inline xmlns:a="http://schemas.openxmlformats.org/drawingml/2006/main" xmlns:pic="http://schemas.openxmlformats.org/drawingml/2006/picture">
-            <wp:extent cx="5400000" cy="3115556"/>
+            <wp:extent cx="5400000" cy="2425000"/>
             <wp:docPr id="14" name="Picture 14"/>
             <wp:cNvGraphicFramePr>
               <a:graphicFrameLocks noChangeAspect="1"/>
@@ -987,7 +987,7 @@
                   <pic:spPr>
                     <a:xfrm>
                       <a:off x="0" y="0"/>
-                      <a:ext cx="5400000" cy="3115556"/>
+                      <a:ext cx="5400000" cy="2425000"/>
                     </a:xfrm>
                     <a:prstGeom prst="rect"/>
                   </pic:spPr>
@@ -1002,7 +1002,7 @@
       <w:r>
         <w:drawing>
           <wp:inline xmlns:a="http://schemas.openxmlformats.org/drawingml/2006/main" xmlns:pic="http://schemas.openxmlformats.org/drawingml/2006/picture">
-            <wp:extent cx="5400000" cy="3546667"/>
+            <wp:extent cx="5400000" cy="2425000"/>
             <wp:docPr id="15" name="Picture 15"/>
             <wp:cNvGraphicFramePr>
               <a:graphicFrameLocks noChangeAspect="1"/>
@@ -1023,7 +1023,7 @@
                   <pic:spPr>
                     <a:xfrm>
                       <a:off x="0" y="0"/>
-                      <a:ext cx="5400000" cy="3546667"/>
+                      <a:ext cx="5400000" cy="2425000"/>
                     </a:xfrm>
                     <a:prstGeom prst="rect"/>
                   </pic:spPr>

</xml_diff>